<commit_message>
report: fill Table B.1 page number in List of Tables
</commit_message>
<xml_diff>
--- a/report/RefurbIQ_PBL3_Report.docx
+++ b/report/RefurbIQ_PBL3_Report.docx
@@ -3824,7 +3824,7 @@
                 <w:i w:val="0"/>
                 <w:sz w:val="24"/>
               </w:rPr>
-              <w:t>«pg:list:tabB.1»</w:t>
+              <w:t>18</w:t>
             </w:r>
           </w:p>
         </w:tc>
@@ -13882,7 +13882,7 @@
           <w:i/>
           <w:sz w:val="24"/>
         </w:rPr>
-        <w:t>Table B.1: Sample annotations (page n/a)</w:t>
+        <w:t>Table B.1: Sample annotations (page 18)</w:t>
       </w:r>
     </w:p>
     <w:tbl>

</xml_diff>